<commit_message>
Add AGENTS.md, agent.md, sync_resume script, and synchronize DOCX & PDF resumes
</commit_message>
<xml_diff>
--- a/Ravindrakumar_Suthar_Resume.docx
+++ b/Ravindrakumar_Suthar_Resume.docx
@@ -1008,7 +1008,7 @@
                 <w:sz w:val="19"/>
                 <w:szCs w:val="19"/>
               </w:rPr>
-              <w:t xml:space="preserve">Devin AI (Autonomous Coding), GitHub Copilot (AI Pair Programming), Claude, OpenAI, LangChain, Antigravity, Figma, Adobe XD</w:t>
+              <w:t xml:space="preserve">RAG (Retrieval-Augmented Generation), Non-AEM to AEM Migration AI Agent &amp; Integrated VS Code Extension, Enterprise Prompt Engineering, AST Transformation Scripts, Devin AI, GitHub Copilot, Claude, OpenAI APIs, Google Antigravity SDK, LangChain</w:t>
             </w:r>
           </w:p>
         </w:tc>
@@ -1476,6 +1476,36 @@
           <w:szCs w:val="19"/>
         </w:rPr>
         <w:t xml:space="preserve"> to Micro-frontend architectures, maintaining 100% business continuity throughout the multi-phase transition.</w:t>
+      </w:r>
+    </w:p>
+    <w:p>
+      <w:pPr>
+        <w:pStyle w:val="ListParagraph"/>
+        <w:numPr>
+          <w:ilvl w:val="0"/>
+          <w:numId w:val="2"/>
+        </w:numPr>
+        <w:spacing w:after="40" w:before="40"/>
+      </w:pPr>
+      <w:r>
+        <w:rPr>
+          <w:rFonts w:ascii="Arial" w:cs="Arial" w:eastAsia="Arial" w:hAnsi="Arial"/>
+          <w:b/>
+          <w:bCs/>
+          <w:color w:val="1A202C"/>
+          <w:sz w:val="19"/>
+          <w:szCs w:val="19"/>
+        </w:rPr>
+        <w:t xml:space="preserve">Architected Autonomous Non-AEM to AEM Migration AI Agent &amp; Integrated VS Code Extension: </w:t>
+      </w:r>
+      <w:r>
+        <w:rPr>
+          <w:rFonts w:ascii="Arial" w:cs="Arial" w:eastAsia="Arial" w:hAnsi="Arial"/>
+          <w:color w:val="4A5568"/>
+          <w:sz w:val="19"/>
+          <w:szCs w:val="19"/>
+        </w:rPr>
+        <w:t xml:space="preserve">Engineered a unified developer productivity platform where an autonomous AI migration agent operates directly within a custom VS Code extension — combining Retrieval-Augmented Generation (RAG), automated prompt engineering templates, and custom AST parsing scripts to migrate legacy non-AEM component trees into idiomatic Adobe Experience Manager (AEM) Core Components, HTL templates, and Sling models, slashing migration cycle times by over 60%.</w:t>
       </w:r>
     </w:p>
     <w:p>

</xml_diff>

<commit_message>
Synchronize LinkedIn competencies (Module Federation, Redux Toolkit, Jest, Cross-Functional Leadership) and Workday ATS profile
</commit_message>
<xml_diff>
--- a/Ravindrakumar_Suthar_Resume.docx
+++ b/Ravindrakumar_Suthar_Resume.docx
@@ -127,7 +127,7 @@
           <w:sz w:val="18"/>
           <w:szCs w:val="18"/>
         </w:rPr>
-        <w:t xml:space="preserve">linkedin.com/in/ravindrasuthar  |</w:t>
+        <w:t xml:space="preserve">https://www.linkedin.com/in/ravindrasuthar/  |</w:t>
       </w:r>
       <w:r>
         <w:rPr>
@@ -298,7 +298,7 @@
           <w:sz w:val="19"/>
           <w:szCs w:val="19"/>
         </w:rPr>
-        <w:t xml:space="preserve">Micro-frontends, Reference Architecture, UI SDK Development, npm &amp; Yarn Workspaces, System Design, UI Platforms, API and Iframe Integration, postMessage Protocols, Core Web Vitals, Bundle Optimization.</w:t>
+        <w:t xml:space="preserve">Micro-frontends, Module Federation, Reference Architecture, UI SDK Development, npm &amp; Yarn Workspaces, System Design, UI Platforms, API and Iframe Integration, postMessage Protocols, Core Web Vitals, Bundle Optimization.</w:t>
       </w:r>
     </w:p>
     <w:p>
@@ -323,7 +323,7 @@
           <w:sz w:val="19"/>
           <w:szCs w:val="19"/>
         </w:rPr>
-        <w:t xml:space="preserve">React, Next.js, TypeScript, JavaScript (ES6+), Redux, Zustand, Tailwind CSS, Vanilla CSS, SCSS, LESS, Vite, Webpack, Babel, Cypress, React Testing Library.</w:t>
+        <w:t xml:space="preserve">React, Next.js, TypeScript, JavaScript (ES6+), Redux, Redux Toolkit, Zustand, Tailwind CSS, Vanilla CSS, SCSS, LESS, Vite, Webpack, Babel, Cypress, Jest, React Testing Library.</w:t>
       </w:r>
     </w:p>
     <w:p>
@@ -348,7 +348,7 @@
           <w:sz w:val="19"/>
           <w:szCs w:val="19"/>
         </w:rPr>
-        <w:t xml:space="preserve">Agile &amp; Scrum Leadership, Certified ScrumMaster (CSM), SDLC Optimization, Workday Platform Uploads, Budget Management, Capacity Planning, Talent Acquisition, Coaching &amp; Mentorship.</w:t>
+        <w:t xml:space="preserve">Cross-Functional Leadership, Agile &amp; Scrum Leadership, Certified ScrumMaster (CSM), SDLC Optimization, Workday Platform Uploads, Budget Management, Vendor Management, Talent Acquisition, Coaching &amp; Mentorship.</w:t>
       </w:r>
     </w:p>
     <w:p>

</xml_diff>

<commit_message>
Update Developer Tools URL to https://ravindra.lets.gen.in/tools across resume, docx, pdf, index, llms.txt, and worker AI
</commit_message>
<xml_diff>
--- a/Ravindrakumar_Suthar_Resume.docx
+++ b/Ravindrakumar_Suthar_Resume.docx
@@ -138,7 +138,7 @@
           <w:sz w:val="18"/>
           <w:szCs w:val="18"/>
         </w:rPr>
-        <w:t xml:space="preserve">Profile &amp; Portfolio:</w:t>
+        <w:t xml:space="preserve">Portfolio:</w:t>
       </w:r>
       <w:r>
         <w:rPr>
@@ -147,7 +147,27 @@
           <w:sz w:val="18"/>
           <w:szCs w:val="18"/>
         </w:rPr>
-        <w:t xml:space="preserve">https://ravindra.lets.gen.in/</w:t>
+        <w:t xml:space="preserve">https://ravindra.lets.gen.in/  |</w:t>
+      </w:r>
+      <w:r>
+        <w:rPr>
+          <w:rFonts w:ascii="Arial" w:hAnsi="Arial" w:cs="Arial"/>
+          <w:b/>
+          <w:bCs/>
+          <w:color w:val="4A5568"/>
+          <w:sz w:val="18"/>
+          <w:szCs w:val="18"/>
+        </w:rPr>
+        <w:t xml:space="preserve">Tools:</w:t>
+      </w:r>
+      <w:r>
+        <w:rPr>
+          <w:rFonts w:ascii="Arial" w:hAnsi="Arial" w:cs="Arial"/>
+          <w:color w:val="2B6CB0"/>
+          <w:sz w:val="18"/>
+          <w:szCs w:val="18"/>
+        </w:rPr>
+        <w:t xml:space="preserve">https://ravindra.lets.gen.in/tools</w:t>
       </w:r>
     </w:p>
     <w:p>
@@ -1235,6 +1255,31 @@
           <w:szCs w:val="19"/>
         </w:rPr>
         <w:t xml:space="preserve">Specialized browser runtime JavaScript utility that protects DOM attributes from tampering via browser developer tools. Engineered for client-side state integrity in mission-critical BFSI transactional workflows (rmsuthar.github.io/StateGuard).</w:t>
+      </w:r>
+    </w:p>
+    <w:p>
+      <w:pPr>
+        <w:spacing w:before="25" w:after="25"/>
+      </w:pPr>
+      <w:r>
+        <w:rPr>
+          <w:rFonts w:ascii="Arial" w:hAnsi="Arial" w:cs="Arial"/>
+          <w:b/>
+          <w:bCs/>
+          <w:color w:val="1A202C"/>
+          <w:sz w:val="19"/>
+          <w:szCs w:val="19"/>
+        </w:rPr>
+        <w:t xml:space="preserve">Enterprise Developer Tools &amp; Utilities:</w:t>
+      </w:r>
+      <w:r>
+        <w:rPr>
+          <w:rFonts w:ascii="Arial" w:hAnsi="Arial" w:cs="Arial"/>
+          <w:color w:val="2D3748"/>
+          <w:sz w:val="19"/>
+          <w:szCs w:val="19"/>
+        </w:rPr>
+        <w:t xml:space="preserve">Production-grade client-side developer toolbox and security utilities (https://ravindra.lets.gen.in/tools).</w:t>
       </w:r>
     </w:p>
     <w:p>

</xml_diff>

<commit_message>
feat(a11y): enhance accessibility to WCAG 2.2 AA/AAA standards
- WCAG 2.2 SC 2.4.11 & SC 2.4.12: Focus Not Obscured (Minimum & Enhanced) with scroll-margin-top/bottom
- WCAG 2.2 SC 2.4.13: Focus Appearance (AAA) dual-layer high-contrast rings
- WCAG 2.2 SC 2.5.8: Pointer Target Size (Minimum 36-44px)
- Multi-anchor skip navigation across index.html and resume.html
- Keyboard trap management with Escape key dismissal and focus restoration in app.js
- Enhanced color contrast on --text-muted (#475569, 5.7:1)
- Support for prefers-reduced-motion and forced-colors (Windows High Contrast Mode)
- Synchronized DOCX, PDF, llms.txt, and worker.js with 100% Workday ATS audit
</commit_message>
<xml_diff>
--- a/Ravindrakumar_Suthar_Resume.docx
+++ b/Ravindrakumar_Suthar_Resume.docx
@@ -240,7 +240,7 @@
           <w:sz w:val="19"/>
           <w:szCs w:val="19"/>
         </w:rPr>
-        <w:t xml:space="preserve">, modernizing legacy systems into zero-downtime micro-frontends, and establishing enterprise accessibility (WCAG 2.1/2.2 AA, ADA, Section 508) and client-side security practices.</w:t>
+        <w:t xml:space="preserve">, modernizing legacy systems into zero-downtime micro-frontends, and establishing enterprise accessibility (WCAG 2.1 &amp; 2.2 Level AA/AAA, ADA, Section 508) and client-side security practices.</w:t>
       </w:r>
     </w:p>
     <w:p>
@@ -393,7 +393,7 @@
           <w:sz w:val="19"/>
           <w:szCs w:val="19"/>
         </w:rPr>
-        <w:t xml:space="preserve">WCAG 2.1 / 2.2 AA, Section 508, ADA Compliance, axe-core, Lighthouse CI, NVDA Audits, Content Security Policy (CSP), OWASP Top 10, DOM Runtime Integrity (StateGuard.js).</w:t>
+        <w:t xml:space="preserve">WCAG 2.1 &amp; 2.2 (Level AA / AAA), Section 508, ADA Compliance, Focus Appearance (SC 2.4.13), Focus Not Obscured (SC 2.4.11), Target Size (SC 2.5.8), axe-core, Lighthouse CI, NVDA Audits, Content Security Policy (CSP), OWASP Top 10, DOM Runtime Integrity (StateGuard.js).</w:t>
       </w:r>
     </w:p>
     <w:p>

</xml_diff>

<commit_message>
feat(projects): add Digital Table Clock & Calendar PWA; remove obsolete tools from showcase
</commit_message>
<xml_diff>
--- a/Ravindrakumar_Suthar_Resume.docx
+++ b/Ravindrakumar_Suthar_Resume.docx
@@ -1270,16 +1270,41 @@
           <w:sz w:val="19"/>
           <w:szCs w:val="19"/>
         </w:rPr>
-        <w:t xml:space="preserve">Enterprise Developer Tools &amp; Utilities:</w:t>
-      </w:r>
-      <w:r>
-        <w:rPr>
-          <w:rFonts w:ascii="Arial" w:hAnsi="Arial" w:cs="Arial"/>
-          <w:color w:val="2D3748"/>
-          <w:sz w:val="19"/>
-          <w:szCs w:val="19"/>
-        </w:rPr>
-        <w:t xml:space="preserve">Production-grade client-side developer toolbox and security utilities (https://ravindra.lets.gen.in/tools).</w:t>
+        <w:t xml:space="preserve">Gujarat Panchang &amp; Automated Broadcast System:</w:t>
+      </w:r>
+      <w:r>
+        <w:rPr>
+          <w:rFonts w:ascii="Arial" w:hAnsi="Arial" w:cs="Arial"/>
+          <w:color w:val="2D3748"/>
+          <w:sz w:val="19"/>
+          <w:szCs w:val="19"/>
+        </w:rPr>
+        <w:t xml:space="preserve">High-precision astronomical calculation engine (Python/PyEphem Lahiri ephemeris math), zero-framework edge web app (Cloudflare Pages), clientside real-time Choghadiya &amp; SVG lunar engine, and unattended headless Playwright WhatsApp Channel distribution (tithi.lets.gen.in).</w:t>
+      </w:r>
+    </w:p>
+    <w:p>
+      <w:pPr>
+        <w:spacing w:before="25" w:after="25"/>
+      </w:pPr>
+      <w:r>
+        <w:rPr>
+          <w:rFonts w:ascii="Arial" w:hAnsi="Arial" w:cs="Arial"/>
+          <w:b/>
+          <w:bCs/>
+          <w:color w:val="1A202C"/>
+          <w:sz w:val="19"/>
+          <w:szCs w:val="19"/>
+        </w:rPr>
+        <w:t xml:space="preserve">Global Edge Sandbox &amp; Multi-Region Load Balancer Inspector:</w:t>
+      </w:r>
+      <w:r>
+        <w:rPr>
+          <w:rFonts w:ascii="Arial" w:hAnsi="Arial" w:cs="Arial"/>
+          <w:color w:val="2D3748"/>
+          <w:sz w:val="19"/>
+          <w:szCs w:val="19"/>
+        </w:rPr>
+        <w:t xml:space="preserve">Edge proxy platform built on Cloudflare Workers simulating web access across 12 global PoPs with framebuster neutralization, biometric WebAuthn security, and WCAG AAA theme system (gateway.lets.gen.in).</w:t>
       </w:r>
     </w:p>
     <w:p>
@@ -1295,16 +1320,16 @@
           <w:sz w:val="19"/>
           <w:szCs w:val="19"/>
         </w:rPr>
-        <w:t xml:space="preserve">Global Edge Sandbox &amp; Multi-Region Load Balancer Inspector:</w:t>
-      </w:r>
-      <w:r>
-        <w:rPr>
-          <w:rFonts w:ascii="Arial" w:hAnsi="Arial" w:cs="Arial"/>
-          <w:color w:val="2D3748"/>
-          <w:sz w:val="19"/>
-          <w:szCs w:val="19"/>
-        </w:rPr>
-        <w:t xml:space="preserve">Edge proxy platform built on Cloudflare Workers simulating web access across 12 global PoPs with framebuster neutralization, biometric WebAuthn security, and WCAG AAA theme system (gateway.lets.gen.in).</w:t>
+        <w:t xml:space="preserve">Digital Table Clock &amp; Calendar PWA:</w:t>
+      </w:r>
+      <w:r>
+        <w:rPr>
+          <w:rFonts w:ascii="Arial" w:hAnsi="Arial" w:cs="Arial"/>
+          <w:color w:val="2D3748"/>
+          <w:sz w:val="19"/>
+          <w:szCs w:val="19"/>
+        </w:rPr>
+        <w:t xml:space="preserve">Lightweight, ultra-crisp desk clock and calendar PWA engineered for vintage hardware upcycling (iPads, Android tablets) with 60 FPS zero-framework performance, OLED true-black power saving, Screen Wake Lock API, and offline Service Worker caching (clock.lets.gen.in).</w:t>
       </w:r>
     </w:p>
     <w:p>

</xml_diff>

<commit_message>
feat(resume): streamline resume to StateGuard.js and Global Edge Sandbox; keep remaining engines in tools
</commit_message>
<xml_diff>
--- a/Ravindrakumar_Suthar_Resume.docx
+++ b/Ravindrakumar_Suthar_Resume.docx
@@ -1259,32 +1259,7 @@
     </w:p>
     <w:p>
       <w:pPr>
-        <w:spacing w:before="25" w:after="25"/>
-      </w:pPr>
-      <w:r>
-        <w:rPr>
-          <w:rFonts w:ascii="Arial" w:hAnsi="Arial" w:cs="Arial"/>
-          <w:b/>
-          <w:bCs/>
-          <w:color w:val="1A202C"/>
-          <w:sz w:val="19"/>
-          <w:szCs w:val="19"/>
-        </w:rPr>
-        <w:t xml:space="preserve">Gujarat Panchang &amp; Automated Broadcast System:</w:t>
-      </w:r>
-      <w:r>
-        <w:rPr>
-          <w:rFonts w:ascii="Arial" w:hAnsi="Arial" w:cs="Arial"/>
-          <w:color w:val="2D3748"/>
-          <w:sz w:val="19"/>
-          <w:szCs w:val="19"/>
-        </w:rPr>
-        <w:t xml:space="preserve">High-precision astronomical calculation engine (Python/PyEphem Lahiri ephemeris math), zero-framework edge web app (Cloudflare Pages), clientside real-time Choghadiya &amp; SVG lunar engine, and unattended headless Playwright WhatsApp Channel distribution (tithi.lets.gen.in).</w:t>
-      </w:r>
-    </w:p>
-    <w:p>
-      <w:pPr>
-        <w:spacing w:before="25" w:after="25"/>
+        <w:spacing w:before="25" w:after="60"/>
       </w:pPr>
       <w:r>
         <w:rPr>
@@ -1305,31 +1280,6 @@
           <w:szCs w:val="19"/>
         </w:rPr>
         <w:t xml:space="preserve">Edge proxy platform built on Cloudflare Workers simulating web access across 12 global PoPs with framebuster neutralization, biometric WebAuthn security, and WCAG AAA theme system (gateway.lets.gen.in).</w:t>
-      </w:r>
-    </w:p>
-    <w:p>
-      <w:pPr>
-        <w:spacing w:before="25" w:after="60"/>
-      </w:pPr>
-      <w:r>
-        <w:rPr>
-          <w:rFonts w:ascii="Arial" w:hAnsi="Arial" w:cs="Arial"/>
-          <w:b/>
-          <w:bCs/>
-          <w:color w:val="1A202C"/>
-          <w:sz w:val="19"/>
-          <w:szCs w:val="19"/>
-        </w:rPr>
-        <w:t xml:space="preserve">Digital Table Clock &amp; Calendar PWA:</w:t>
-      </w:r>
-      <w:r>
-        <w:rPr>
-          <w:rFonts w:ascii="Arial" w:hAnsi="Arial" w:cs="Arial"/>
-          <w:color w:val="2D3748"/>
-          <w:sz w:val="19"/>
-          <w:szCs w:val="19"/>
-        </w:rPr>
-        <w:t xml:space="preserve">Lightweight, ultra-crisp desk clock and calendar PWA engineered for vintage hardware upcycling (iPads, Android tablets) with 60 FPS zero-framework performance, OLED true-black power saving, Screen Wake Lock API, and offline Service Worker caching (clock.lets.gen.in).</w:t>
       </w:r>
     </w:p>
     <w:p>

</xml_diff>